<commit_message>
feat(faq): add Q32 on INR donation eligibility for Indian citizens
</commit_message>
<xml_diff>
--- a/data/raw/Future-Ready Children_ FAQ.docx
+++ b/data/raw/Future-Ready Children_ FAQ.docx
@@ -3067,6 +3067,29 @@
     <w:p>
       <w:pPr>
         <w:pStyle w:val="Heading3"/>
+      </w:pPr>
+      <w:r>
+        <w:t>32. Why can’t I pay in INR even though I have a bank account in India?</w:t>
+      </w:r>
+    </w:p>
+    <w:p>
+      <w:pPr/>
+      <w:r>
+        <w:t>INR donations are available only to Indian citizens.</w:t>
+      </w:r>
+    </w:p>
+    <w:p>
+      <w:pPr/>
+      <w:r>
+        <w:t>If you are a citizen of a country other than India, you will need to make your donation in USD, even if you have a bank account in India.</w:t>
+      </w:r>
+    </w:p>
+    <w:p>
+      <w:pPr/>
+    </w:p>
+    <w:p>
+      <w:pPr>
+        <w:pStyle w:val="Heading3"/>
         <w:keepNext w:val="0"/>
         <w:keepLines w:val="0"/>
         <w:spacing w:before="280" w:lineRule="auto"/>
@@ -3077,16 +3100,8 @@
           <w:szCs w:val="26"/>
         </w:rPr>
       </w:pPr>
-      <w:bookmarkStart w:colFirst="0" w:colLast="0" w:name="_mszq5lbkez9f" w:id="36"/>
-      <w:bookmarkEnd w:id="36"/>
-      <w:r>
-        <w:rPr>
-          <w:color w:val="000000"/>
-          <w:sz w:val="26"/>
-          <w:szCs w:val="26"/>
-          <w:rtl w:val="0"/>
-        </w:rPr>
-        <w:t xml:space="preserve">32. “I would like to support the campaign, but I have more questions.”</w:t>
+      <w:r>
+        <w:t>33. “I would like to support the campaign, but I have more questions.”</w:t>
       </w:r>
     </w:p>
     <w:p>

</xml_diff>